<commit_message>
Corrige instrucao do Wokwi: template Arduino, nao ESP-IDF
O build falhava com 'unknown type name class' porque o projeto tinha sido
criado no template ESP-IDF, cujo arquivo principal e main.c e e compilado
como C. O mesmo codigo em C++ nao compila ali.

Os dois relatorios de IoT agora apontam para
https://wokwi.com/projects/new/esp32 e explicam que o arquivo precisa ser
sketch.ino, com nota sobre o sintoma caso o template errado seja usado.

Co-Authored-By: Claude Opus 5 <noreply@anthropic.com>
</commit_message>
<xml_diff>
--- a/entregas/IoT/Lab Semana 07/entrega/Lab Semana 07 - IoT.docx
+++ b/entregas/IoT/Lab Semana 07/entrega/Lab Semana 07 - IoT.docx
@@ -8009,7 +8009,7 @@
           <w:sz w:val="24"/>
           <w:szCs w:val="24"/>
         </w:rPr>
-        <w:t xml:space="preserve">Para o assinante: criar um projeto ESP32 no Wokwi, colar </w:t>
+        <w:t xml:space="preserve">Para o assinante: criar outro projeto pelo mesmo link, colar </w:t>
       </w:r>
       <w:r>
         <w:rPr>
@@ -8134,6 +8134,129 @@
     </w:p>
     <w:p>
       <w:pPr>
+        <w:spacing w:after="120" w:before="120" w:line="276" w:lineRule="auto"/>
+        <w:ind w:firstLine="0" w:start="0"/>
+        <w:jc w:val="both"/>
+      </w:pPr>
+      <w:r>
+        <w:rPr>
+          <w:rFonts w:ascii="Open Sans" w:hAnsi="Open Sans" w:cs="Open Sans" w:eastAsia="Open Sans"/>
+          <w:b/>
+          <w:bCs/>
+          <w:color w:val="000000"/>
+          <w:sz w:val="24"/>
+          <w:szCs w:val="24"/>
+        </w:rPr>
+        <w:t xml:space="preserve">Atenção ao template.</w:t>
+      </w:r>
+      <w:r>
+        <w:rPr>
+          <w:rFonts w:ascii="Open Sans" w:hAnsi="Open Sans" w:cs="Open Sans" w:eastAsia="Open Sans"/>
+          <w:color w:val="000000"/>
+          <w:sz w:val="24"/>
+          <w:szCs w:val="24"/>
+        </w:rPr>
+        <w:t xml:space="preserve"> Use &lt;https://wokwi.com/projects/new/esp32&gt;, que cria um projeto </w:t>
+      </w:r>
+      <w:r>
+        <w:rPr>
+          <w:rFonts w:ascii="Open Sans" w:hAnsi="Open Sans" w:cs="Open Sans" w:eastAsia="Open Sans"/>
+          <w:b/>
+          <w:bCs/>
+          <w:color w:val="000000"/>
+          <w:sz w:val="24"/>
+          <w:szCs w:val="24"/>
+        </w:rPr>
+        <w:t xml:space="preserve">Arduino</w:t>
+      </w:r>
+      <w:r>
+        <w:rPr>
+          <w:rFonts w:ascii="Open Sans" w:hAnsi="Open Sans" w:cs="Open Sans" w:eastAsia="Open Sans"/>
+          <w:color w:val="000000"/>
+          <w:sz w:val="24"/>
+          <w:szCs w:val="24"/>
+        </w:rPr>
+        <w:t xml:space="preserve"> — o arquivo da aba de código precisa se chamar </w:t>
+      </w:r>
+      <w:r>
+        <w:rPr>
+          <w:rFonts w:ascii="Consolas" w:hAnsi="Consolas" w:cs="Consolas" w:eastAsia="Consolas"/>
+          <w:color w:val="000000"/>
+          <w:shd w:val="clear" w:fill="F2F2F2"/>
+          <w:sz w:val="24"/>
+          <w:szCs w:val="24"/>
+        </w:rPr>
+        <w:t xml:space="preserve">sketch.ino</w:t>
+      </w:r>
+      <w:r>
+        <w:rPr>
+          <w:rFonts w:ascii="Open Sans" w:hAnsi="Open Sans" w:cs="Open Sans" w:eastAsia="Open Sans"/>
+          <w:color w:val="000000"/>
+          <w:sz w:val="24"/>
+          <w:szCs w:val="24"/>
+        </w:rPr>
+        <w:t xml:space="preserve">. O Wokwi também oferece um template ESP-IDF cujo arquivo é </w:t>
+      </w:r>
+      <w:r>
+        <w:rPr>
+          <w:rFonts w:ascii="Consolas" w:hAnsi="Consolas" w:cs="Consolas" w:eastAsia="Consolas"/>
+          <w:color w:val="000000"/>
+          <w:shd w:val="clear" w:fill="F2F2F2"/>
+          <w:sz w:val="24"/>
+          <w:szCs w:val="24"/>
+        </w:rPr>
+        <w:t xml:space="preserve">main.c</w:t>
+      </w:r>
+      <w:r>
+        <w:rPr>
+          <w:rFonts w:ascii="Open Sans" w:hAnsi="Open Sans" w:cs="Open Sans" w:eastAsia="Open Sans"/>
+          <w:color w:val="000000"/>
+          <w:sz w:val="24"/>
+          <w:szCs w:val="24"/>
+        </w:rPr>
+        <w:t xml:space="preserve">; nele o mesmo código falha na compilação com </w:t>
+      </w:r>
+      <w:r>
+        <w:rPr>
+          <w:rFonts w:ascii="Consolas" w:hAnsi="Consolas" w:cs="Consolas" w:eastAsia="Consolas"/>
+          <w:color w:val="000000"/>
+          <w:shd w:val="clear" w:fill="F2F2F2"/>
+          <w:sz w:val="24"/>
+          <w:szCs w:val="24"/>
+        </w:rPr>
+        <w:t xml:space="preserve">unknown type name class</w:t>
+      </w:r>
+      <w:r>
+        <w:rPr>
+          <w:rFonts w:ascii="Open Sans" w:hAnsi="Open Sans" w:cs="Open Sans" w:eastAsia="Open Sans"/>
+          <w:color w:val="000000"/>
+          <w:sz w:val="24"/>
+          <w:szCs w:val="24"/>
+        </w:rPr>
+        <w:t xml:space="preserve">, porque o </w:t>
+      </w:r>
+      <w:r>
+        <w:rPr>
+          <w:rFonts w:ascii="Consolas" w:hAnsi="Consolas" w:cs="Consolas" w:eastAsia="Consolas"/>
+          <w:color w:val="000000"/>
+          <w:shd w:val="clear" w:fill="F2F2F2"/>
+          <w:sz w:val="24"/>
+          <w:szCs w:val="24"/>
+        </w:rPr>
+        <w:t xml:space="preserve">.c</w:t>
+      </w:r>
+      <w:r>
+        <w:rPr>
+          <w:rFonts w:ascii="Open Sans" w:hAnsi="Open Sans" w:cs="Open Sans" w:eastAsia="Open Sans"/>
+          <w:color w:val="000000"/>
+          <w:sz w:val="24"/>
+          <w:szCs w:val="24"/>
+        </w:rPr>
+        <w:t xml:space="preserve"> é compilado como C e não como C++.</w:t>
+      </w:r>
+    </w:p>
+    <w:p>
+      <w:pPr>
         <w:spacing w:after="40" w:before="40" w:line="276" w:lineRule="auto"/>
         <w:ind w:firstLine="0" w:start="360"/>
         <w:jc w:val="start"/>
@@ -8154,7 +8277,7 @@
           <w:sz w:val="24"/>
           <w:szCs w:val="24"/>
         </w:rPr>
-        <w:t xml:space="preserve">Abrir &lt;https://wokwi.com&gt; e criar um projeto </w:t>
+        <w:t xml:space="preserve">Abrir &lt;https://wokwi.com/projects/new/esp32&gt; — o template </w:t>
       </w:r>
       <w:r>
         <w:rPr>
@@ -8165,7 +8288,42 @@
           <w:sz w:val="24"/>
           <w:szCs w:val="24"/>
         </w:rPr>
-        <w:t xml:space="preserve">ESP32</w:t>
+        <w:t xml:space="preserve">Arduino</w:t>
+      </w:r>
+      <w:r>
+        <w:rPr>
+          <w:rFonts w:ascii="Open Sans" w:hAnsi="Open Sans" w:cs="Open Sans" w:eastAsia="Open Sans"/>
+          <w:color w:val="000000"/>
+          <w:sz w:val="24"/>
+          <w:szCs w:val="24"/>
+        </w:rPr>
+        <w:t xml:space="preserve">, cujo arquivo</w:t>
+      </w:r>
+    </w:p>
+    <w:p>
+      <w:pPr>
+        <w:spacing w:after="120" w:before="120" w:line="276" w:lineRule="auto"/>
+        <w:ind w:firstLine="0" w:start="0"/>
+        <w:jc w:val="both"/>
+      </w:pPr>
+      <w:r>
+        <w:rPr>
+          <w:rFonts w:ascii="Open Sans" w:hAnsi="Open Sans" w:cs="Open Sans" w:eastAsia="Open Sans"/>
+          <w:color w:val="000000"/>
+          <w:sz w:val="24"/>
+          <w:szCs w:val="24"/>
+        </w:rPr>
+        <w:t xml:space="preserve">   principal é </w:t>
+      </w:r>
+      <w:r>
+        <w:rPr>
+          <w:rFonts w:ascii="Consolas" w:hAnsi="Consolas" w:cs="Consolas" w:eastAsia="Consolas"/>
+          <w:color w:val="000000"/>
+          <w:shd w:val="clear" w:fill="F2F2F2"/>
+          <w:sz w:val="24"/>
+          <w:szCs w:val="24"/>
+        </w:rPr>
+        <w:t xml:space="preserve">sketch.ino</w:t>
       </w:r>
       <w:r>
         <w:rPr>

</xml_diff>